<commit_message>
chore: add document generation and inspection tools
Install libraries for document processing (jspdf, html2canvas) and include helper scripts to inspect Excel templates. Updated project metadata and title.
</commit_message>
<xml_diff>
--- a/public/templates/CANVASS_TEMPLATE.docx
+++ b/public/templates/CANVASS_TEMPLATE.docx
@@ -6,14 +6,14 @@
       <w:tblPr>
         <w:tblStyle w:val="TableGrid"/>
         <w:tblpPr w:leftFromText="180" w:rightFromText="180" w:vertAnchor="text" w:horzAnchor="margin" w:tblpXSpec="center" w:tblpY="286"/>
-        <w:tblW w:w="11186" w:type="dxa"/>
+        <w:tblW w:w="11335" w:type="dxa"/>
         <w:tblLook w:val="04A0" w:firstRow="1" w:lastRow="0" w:firstColumn="1" w:lastColumn="0" w:noHBand="0" w:noVBand="1"/>
       </w:tblPr>
       <w:tblGrid>
         <w:gridCol w:w="2018"/>
         <w:gridCol w:w="5688"/>
         <w:gridCol w:w="1796"/>
-        <w:gridCol w:w="1684"/>
+        <w:gridCol w:w="1833"/>
       </w:tblGrid>
       <w:tr>
         <w:trPr>
@@ -21,7 +21,7 @@
         </w:trPr>
         <w:tc>
           <w:tcPr>
-            <w:tcW w:w="7735" w:type="dxa"/>
+            <w:tcW w:w="7706" w:type="dxa"/>
             <w:gridSpan w:val="2"/>
             <w:vMerge w:val="restart"/>
           </w:tcPr>
@@ -202,7 +202,7 @@
         </w:tc>
         <w:tc>
           <w:tcPr>
-            <w:tcW w:w="1800" w:type="dxa"/>
+            <w:tcW w:w="1796" w:type="dxa"/>
           </w:tcPr>
           <w:p>
             <w:pPr>
@@ -225,7 +225,7 @@
         </w:tc>
         <w:tc>
           <w:tcPr>
-            <w:tcW w:w="1651" w:type="dxa"/>
+            <w:tcW w:w="1833" w:type="dxa"/>
           </w:tcPr>
           <w:p>
             <w:pPr>
@@ -254,7 +254,7 @@
         </w:trPr>
         <w:tc>
           <w:tcPr>
-            <w:tcW w:w="7735" w:type="dxa"/>
+            <w:tcW w:w="7706" w:type="dxa"/>
             <w:gridSpan w:val="2"/>
             <w:vMerge/>
           </w:tcPr>
@@ -271,7 +271,7 @@
         </w:tc>
         <w:tc>
           <w:tcPr>
-            <w:tcW w:w="1800" w:type="dxa"/>
+            <w:tcW w:w="1796" w:type="dxa"/>
           </w:tcPr>
           <w:p>
             <w:pPr>
@@ -294,7 +294,7 @@
         </w:tc>
         <w:tc>
           <w:tcPr>
-            <w:tcW w:w="1651" w:type="dxa"/>
+            <w:tcW w:w="1833" w:type="dxa"/>
           </w:tcPr>
           <w:p>
             <w:pPr>
@@ -315,7 +315,7 @@
         </w:trPr>
         <w:tc>
           <w:tcPr>
-            <w:tcW w:w="7735" w:type="dxa"/>
+            <w:tcW w:w="7706" w:type="dxa"/>
             <w:gridSpan w:val="2"/>
             <w:vMerge/>
           </w:tcPr>
@@ -332,7 +332,7 @@
         </w:tc>
         <w:tc>
           <w:tcPr>
-            <w:tcW w:w="1800" w:type="dxa"/>
+            <w:tcW w:w="1796" w:type="dxa"/>
           </w:tcPr>
           <w:p>
             <w:pPr>
@@ -355,7 +355,7 @@
         </w:tc>
         <w:tc>
           <w:tcPr>
-            <w:tcW w:w="1651" w:type="dxa"/>
+            <w:tcW w:w="1833" w:type="dxa"/>
           </w:tcPr>
           <w:p>
             <w:pPr>
@@ -375,7 +375,7 @@
         </w:trPr>
         <w:tc>
           <w:tcPr>
-            <w:tcW w:w="7735" w:type="dxa"/>
+            <w:tcW w:w="7706" w:type="dxa"/>
             <w:gridSpan w:val="2"/>
             <w:vMerge/>
           </w:tcPr>
@@ -392,7 +392,7 @@
         </w:tc>
         <w:tc>
           <w:tcPr>
-            <w:tcW w:w="1800" w:type="dxa"/>
+            <w:tcW w:w="1796" w:type="dxa"/>
           </w:tcPr>
           <w:p>
             <w:pPr>
@@ -423,7 +423,7 @@
         </w:tc>
         <w:tc>
           <w:tcPr>
-            <w:tcW w:w="1651" w:type="dxa"/>
+            <w:tcW w:w="1833" w:type="dxa"/>
           </w:tcPr>
           <w:p>
             <w:pPr>
@@ -444,7 +444,7 @@
         </w:trPr>
         <w:tc>
           <w:tcPr>
-            <w:tcW w:w="2024" w:type="dxa"/>
+            <w:tcW w:w="2018" w:type="dxa"/>
           </w:tcPr>
           <w:p>
             <w:pPr>
@@ -466,7 +466,7 @@
         </w:tc>
         <w:tc>
           <w:tcPr>
-            <w:tcW w:w="5711" w:type="dxa"/>
+            <w:tcW w:w="5688" w:type="dxa"/>
           </w:tcPr>
           <w:p>
             <w:pPr>
@@ -494,7 +494,7 @@
         </w:tc>
         <w:tc>
           <w:tcPr>
-            <w:tcW w:w="1800" w:type="dxa"/>
+            <w:tcW w:w="1796" w:type="dxa"/>
           </w:tcPr>
           <w:p>
             <w:pPr>
@@ -528,7 +528,7 @@
         </w:tc>
         <w:tc>
           <w:tcPr>
-            <w:tcW w:w="1651" w:type="dxa"/>
+            <w:tcW w:w="1833" w:type="dxa"/>
           </w:tcPr>
           <w:p>
             <w:pPr>
@@ -536,6 +536,8 @@
               <w:jc w:val="center"/>
               <w:rPr>
                 <w:rFonts w:ascii="Arial" w:hAnsi="Arial" w:cs="Arial"/>
+                <w:b/>
+                <w:bCs/>
                 <w:sz w:val="22"/>
                 <w:szCs w:val="22"/>
               </w:rPr>
@@ -543,18 +545,24 @@
             <w:r>
               <w:rPr>
                 <w:rFonts w:ascii="Arial" w:hAnsi="Arial" w:cs="Arial"/>
+                <w:b/>
+                <w:bCs/>
               </w:rPr>
               <w:t>{{</w:t>
             </w:r>
             <w:r>
               <w:rPr>
                 <w:rFonts w:ascii="Arial" w:hAnsi="Arial" w:cs="Arial"/>
+                <w:b/>
+                <w:bCs/>
               </w:rPr>
               <w:t xml:space="preserve">Control </w:t>
             </w:r>
             <w:r>
               <w:rPr>
                 <w:rFonts w:ascii="Arial" w:hAnsi="Arial" w:cs="Arial"/>
+                <w:b/>
+                <w:bCs/>
               </w:rPr>
               <w:t>_NO}}</w:t>
             </w:r>
@@ -601,6 +609,7 @@
         </w:rPr>
         <w:t xml:space="preserve">   </w:t>
       </w:r>
+      <w:proofErr w:type="gramStart"/>
       <w:r>
         <w:rPr>
           <w:rFonts w:ascii="Arial" w:hAnsi="Arial" w:cs="Arial"/>
@@ -629,7 +638,29 @@
           <w:sz w:val="22"/>
           <w:szCs w:val="22"/>
         </w:rPr>
-        <w:t xml:space="preserve">:   </w:t>
+        <w:t>:</w:t>
+      </w:r>
+      <w:proofErr w:type="gramEnd"/>
+      <w:r>
+        <w:rPr>
+          <w:rFonts w:ascii="Arial" w:hAnsi="Arial" w:cs="Arial"/>
+          <w:b/>
+          <w:bCs/>
+          <w:sz w:val="22"/>
+          <w:szCs w:val="22"/>
+        </w:rPr>
+        <w:t xml:space="preserve"> </w:t>
+      </w:r>
+      <w:proofErr w:type="gramStart"/>
+      <w:r>
+        <w:rPr>
+          <w:rFonts w:ascii="Arial" w:hAnsi="Arial" w:cs="Arial"/>
+          <w:b/>
+          <w:bCs/>
+          <w:sz w:val="22"/>
+          <w:szCs w:val="22"/>
+        </w:rPr>
+        <w:t xml:space="preserve">  </w:t>
       </w:r>
       <w:r>
         <w:rPr>
@@ -650,7 +681,19 @@
           <w:sz w:val="22"/>
           <w:szCs w:val="22"/>
         </w:rPr>
-        <w:t>{{</w:t>
+        <w:t>{</w:t>
+      </w:r>
+      <w:proofErr w:type="gramEnd"/>
+      <w:r>
+        <w:rPr>
+          <w:rFonts w:ascii="Arial" w:hAnsi="Arial" w:cs="Arial"/>
+          <w:b/>
+          <w:bCs/>
+          <w:color w:val="4472C4" w:themeColor="accent1"/>
+          <w:sz w:val="22"/>
+          <w:szCs w:val="22"/>
+        </w:rPr>
+        <w:t>{</w:t>
       </w:r>
       <w:r>
         <w:rPr>
@@ -859,8 +902,9 @@
           <w:sz w:val="22"/>
           <w:szCs w:val="22"/>
         </w:rPr>
-        <w:t>Plate No.</w:t>
+        <w:t xml:space="preserve">Plate </w:t>
       </w:r>
+      <w:proofErr w:type="gramStart"/>
       <w:r>
         <w:rPr>
           <w:rFonts w:ascii="Arial" w:hAnsi="Arial" w:cs="Arial"/>
@@ -869,7 +913,7 @@
           <w:sz w:val="22"/>
           <w:szCs w:val="22"/>
         </w:rPr>
-        <w:t xml:space="preserve"> </w:t>
+        <w:t>No.</w:t>
       </w:r>
       <w:r>
         <w:rPr>
@@ -879,7 +923,28 @@
           <w:sz w:val="22"/>
           <w:szCs w:val="22"/>
         </w:rPr>
-        <w:t xml:space="preserve">:  </w:t>
+        <w:t xml:space="preserve"> </w:t>
+      </w:r>
+      <w:r>
+        <w:rPr>
+          <w:rFonts w:ascii="Arial" w:hAnsi="Arial" w:cs="Arial"/>
+          <w:b/>
+          <w:bCs/>
+          <w:sz w:val="22"/>
+          <w:szCs w:val="22"/>
+        </w:rPr>
+        <w:t>:</w:t>
+      </w:r>
+      <w:proofErr w:type="gramEnd"/>
+      <w:r>
+        <w:rPr>
+          <w:rFonts w:ascii="Arial" w:hAnsi="Arial" w:cs="Arial"/>
+          <w:b/>
+          <w:bCs/>
+          <w:sz w:val="22"/>
+          <w:szCs w:val="22"/>
+        </w:rPr>
+        <w:t xml:space="preserve">  </w:t>
       </w:r>
       <w:r>
         <w:rPr>
@@ -890,7 +955,19 @@
           <w:sz w:val="22"/>
           <w:szCs w:val="22"/>
         </w:rPr>
-        <w:t xml:space="preserve">       </w:t>
+        <w:t xml:space="preserve">    </w:t>
+      </w:r>
+      <w:proofErr w:type="gramStart"/>
+      <w:r>
+        <w:rPr>
+          <w:rFonts w:ascii="Arial" w:hAnsi="Arial" w:cs="Arial"/>
+          <w:b/>
+          <w:bCs/>
+          <w:color w:val="000000" w:themeColor="text1"/>
+          <w:sz w:val="22"/>
+          <w:szCs w:val="22"/>
+        </w:rPr>
+        <w:t xml:space="preserve">   </w:t>
       </w:r>
       <w:r>
         <w:rPr>
@@ -901,8 +978,9 @@
           <w:sz w:val="22"/>
           <w:szCs w:val="22"/>
         </w:rPr>
-        <w:t>{{</w:t>
+        <w:t>{</w:t>
       </w:r>
+      <w:proofErr w:type="gramEnd"/>
       <w:r>
         <w:rPr>
           <w:rFonts w:ascii="Arial" w:hAnsi="Arial" w:cs="Arial"/>
@@ -912,8 +990,21 @@
           <w:sz w:val="22"/>
           <w:szCs w:val="22"/>
         </w:rPr>
+        <w:t>{</w:t>
+      </w:r>
+      <w:proofErr w:type="spellStart"/>
+      <w:r>
+        <w:rPr>
+          <w:rFonts w:ascii="Arial" w:hAnsi="Arial" w:cs="Arial"/>
+          <w:b/>
+          <w:bCs/>
+          <w:color w:val="4472C4" w:themeColor="accent1"/>
+          <w:sz w:val="22"/>
+          <w:szCs w:val="22"/>
+        </w:rPr>
         <w:t>Plate_No</w:t>
       </w:r>
+      <w:proofErr w:type="spellEnd"/>
       <w:r>
         <w:rPr>
           <w:rFonts w:ascii="Arial" w:hAnsi="Arial" w:cs="Arial"/>
@@ -939,10 +1030,10 @@
       <w:tblPr>
         <w:tblStyle w:val="TableGrid"/>
         <w:tblW w:w="0" w:type="auto"/>
+        <w:jc w:val="center"/>
         <w:tblLook w:val="04A0" w:firstRow="1" w:lastRow="0" w:firstColumn="1" w:lastColumn="0" w:noHBand="0" w:noVBand="1"/>
       </w:tblPr>
       <w:tblGrid>
-        <w:gridCol w:w="2830"/>
         <w:gridCol w:w="2830"/>
         <w:gridCol w:w="2830"/>
         <w:gridCol w:w="2830"/>
@@ -950,6 +1041,7 @@
       <w:tr>
         <w:trPr>
           <w:trHeight w:val="864"/>
+          <w:jc w:val="center"/>
         </w:trPr>
         <w:tc>
           <w:tcPr>
@@ -997,56 +1089,7 @@
                 <w:b/>
                 <w:bCs/>
               </w:rPr>
-              <w:t>{{shop_name</w:t>
-            </w:r>
-            <w:r>
-              <w:rPr>
-                <w:rFonts w:ascii="Arial" w:hAnsi="Arial" w:cs="Arial"/>
-                <w:b/>
-                <w:bCs/>
-              </w:rPr>
-              <w:t>1}}</w:t>
-            </w:r>
-          </w:p>
-        </w:tc>
-        <w:tc>
-          <w:tcPr>
-            <w:tcW w:w="2830" w:type="dxa"/>
-            <w:shd w:val="clear" w:color="auto" w:fill="FFE599" w:themeFill="accent4" w:themeFillTint="66"/>
-          </w:tcPr>
-          <w:p>
-            <w:pPr>
-              <w:spacing w:before="360"/>
-              <w:jc w:val="center"/>
-              <w:rPr>
-                <w:rFonts w:ascii="Arial" w:hAnsi="Arial" w:cs="Arial"/>
-                <w:b/>
-                <w:bCs/>
-              </w:rPr>
-            </w:pPr>
-            <w:r>
-              <w:rPr>
-                <w:rFonts w:ascii="Arial" w:hAnsi="Arial" w:cs="Arial"/>
-                <w:b/>
-                <w:bCs/>
-              </w:rPr>
-              <w:t>{{shop_name</w:t>
-            </w:r>
-            <w:r>
-              <w:rPr>
-                <w:rFonts w:ascii="Arial" w:hAnsi="Arial" w:cs="Arial"/>
-                <w:b/>
-                <w:bCs/>
-              </w:rPr>
-              <w:t>2</w:t>
-            </w:r>
-            <w:r>
-              <w:rPr>
-                <w:rFonts w:ascii="Arial" w:hAnsi="Arial" w:cs="Arial"/>
-                <w:b/>
-                <w:bCs/>
-              </w:rPr>
-              <w:t>}}</w:t>
+              <w:t>{{shop_name1}}</w:t>
             </w:r>
           </w:p>
         </w:tc>
@@ -1079,6 +1122,7 @@
       <w:tr>
         <w:trPr>
           <w:trHeight w:val="576"/>
+          <w:jc w:val="center"/>
         </w:trPr>
         <w:tc>
           <w:tcPr>
@@ -1124,28 +1168,6 @@
                 <w:rFonts w:ascii="Arial" w:hAnsi="Arial" w:cs="Arial"/>
               </w:rPr>
               <w:t>{{contact_person1}}</w:t>
-            </w:r>
-          </w:p>
-        </w:tc>
-        <w:tc>
-          <w:tcPr>
-            <w:tcW w:w="2830" w:type="dxa"/>
-          </w:tcPr>
-          <w:p>
-            <w:pPr>
-              <w:spacing w:before="200"/>
-              <w:jc w:val="center"/>
-              <w:rPr>
-                <w:rFonts w:ascii="Arial" w:hAnsi="Arial" w:cs="Arial"/>
-                <w:b/>
-                <w:bCs/>
-              </w:rPr>
-            </w:pPr>
-            <w:r>
-              <w:rPr>
-                <w:rFonts w:ascii="Arial" w:hAnsi="Arial" w:cs="Arial"/>
-              </w:rPr>
-              <w:t>{{contact_person2}}</w:t>
             </w:r>
           </w:p>
         </w:tc>
@@ -1173,6 +1195,7 @@
       <w:tr>
         <w:trPr>
           <w:trHeight w:val="576"/>
+          <w:jc w:val="center"/>
         </w:trPr>
         <w:tc>
           <w:tcPr>
@@ -1218,28 +1241,6 @@
                 <w:rFonts w:ascii="Arial" w:hAnsi="Arial" w:cs="Arial"/>
               </w:rPr>
               <w:t>((contact_no1}}</w:t>
-            </w:r>
-          </w:p>
-        </w:tc>
-        <w:tc>
-          <w:tcPr>
-            <w:tcW w:w="2830" w:type="dxa"/>
-          </w:tcPr>
-          <w:p>
-            <w:pPr>
-              <w:spacing w:before="200"/>
-              <w:jc w:val="center"/>
-              <w:rPr>
-                <w:rFonts w:ascii="Arial" w:hAnsi="Arial" w:cs="Arial"/>
-                <w:b/>
-                <w:bCs/>
-              </w:rPr>
-            </w:pPr>
-            <w:r>
-              <w:rPr>
-                <w:rFonts w:ascii="Arial" w:hAnsi="Arial" w:cs="Arial"/>
-              </w:rPr>
-              <w:t>((contact_no2}}</w:t>
             </w:r>
           </w:p>
         </w:tc>
@@ -1262,6 +1263,7 @@
       <w:tr>
         <w:trPr>
           <w:trHeight w:val="576"/>
+          <w:jc w:val="center"/>
         </w:trPr>
         <w:tc>
           <w:tcPr>
@@ -1307,28 +1309,6 @@
                 <w:rFonts w:ascii="Arial" w:hAnsi="Arial" w:cs="Arial"/>
               </w:rPr>
               <w:t>{{work_duration1}}</w:t>
-            </w:r>
-          </w:p>
-        </w:tc>
-        <w:tc>
-          <w:tcPr>
-            <w:tcW w:w="2830" w:type="dxa"/>
-          </w:tcPr>
-          <w:p>
-            <w:pPr>
-              <w:spacing w:before="200"/>
-              <w:jc w:val="center"/>
-              <w:rPr>
-                <w:rFonts w:ascii="Arial" w:hAnsi="Arial" w:cs="Arial"/>
-                <w:b/>
-                <w:bCs/>
-              </w:rPr>
-            </w:pPr>
-            <w:r>
-              <w:rPr>
-                <w:rFonts w:ascii="Arial" w:hAnsi="Arial" w:cs="Arial"/>
-              </w:rPr>
-              <w:t>{{work_duration2}}</w:t>
             </w:r>
           </w:p>
         </w:tc>
@@ -1351,6 +1331,7 @@
       <w:tr>
         <w:trPr>
           <w:trHeight w:val="576"/>
+          <w:jc w:val="center"/>
         </w:trPr>
         <w:tc>
           <w:tcPr>
@@ -1396,28 +1377,6 @@
                 <w:rFonts w:ascii="Arial" w:hAnsi="Arial" w:cs="Arial"/>
               </w:rPr>
               <w:t>{{warranty1}}</w:t>
-            </w:r>
-          </w:p>
-        </w:tc>
-        <w:tc>
-          <w:tcPr>
-            <w:tcW w:w="2830" w:type="dxa"/>
-          </w:tcPr>
-          <w:p>
-            <w:pPr>
-              <w:spacing w:before="200"/>
-              <w:jc w:val="center"/>
-              <w:rPr>
-                <w:rFonts w:ascii="Arial" w:hAnsi="Arial" w:cs="Arial"/>
-                <w:b/>
-                <w:bCs/>
-              </w:rPr>
-            </w:pPr>
-            <w:r>
-              <w:rPr>
-                <w:rFonts w:ascii="Arial" w:hAnsi="Arial" w:cs="Arial"/>
-              </w:rPr>
-              <w:t>{{warranty2}}</w:t>
             </w:r>
           </w:p>
         </w:tc>
@@ -1440,6 +1399,7 @@
       <w:tr>
         <w:trPr>
           <w:trHeight w:val="576"/>
+          <w:jc w:val="center"/>
         </w:trPr>
         <w:tc>
           <w:tcPr>
@@ -1485,28 +1445,6 @@
                 <w:rFonts w:ascii="Arial" w:hAnsi="Arial" w:cs="Arial"/>
               </w:rPr>
               <w:t>{{payment_terms1}}</w:t>
-            </w:r>
-          </w:p>
-        </w:tc>
-        <w:tc>
-          <w:tcPr>
-            <w:tcW w:w="2830" w:type="dxa"/>
-          </w:tcPr>
-          <w:p>
-            <w:pPr>
-              <w:spacing w:before="200"/>
-              <w:jc w:val="center"/>
-              <w:rPr>
-                <w:rFonts w:ascii="Arial" w:hAnsi="Arial" w:cs="Arial"/>
-                <w:b/>
-                <w:bCs/>
-              </w:rPr>
-            </w:pPr>
-            <w:r>
-              <w:rPr>
-                <w:rFonts w:ascii="Arial" w:hAnsi="Arial" w:cs="Arial"/>
-              </w:rPr>
-              <w:t>{{payment_terms2}}</w:t>
             </w:r>
           </w:p>
         </w:tc>
@@ -1529,18 +1467,8 @@
       <w:tr>
         <w:trPr>
           <w:trHeight w:val="576"/>
+          <w:jc w:val="center"/>
         </w:trPr>
-        <w:tc>
-          <w:tcPr>
-            <w:tcW w:w="2830" w:type="dxa"/>
-            <w:shd w:val="clear" w:color="auto" w:fill="2F5496" w:themeFill="accent1" w:themeFillShade="BF"/>
-          </w:tcPr>
-          <w:p>
-            <w:pPr>
-              <w:spacing w:before="200"/>
-            </w:pPr>
-          </w:p>
-        </w:tc>
         <w:tc>
           <w:tcPr>
             <w:tcW w:w="2830" w:type="dxa"/>
@@ -1578,6 +1506,7 @@
       <w:tr>
         <w:trPr>
           <w:trHeight w:val="576"/>
+          <w:jc w:val="center"/>
         </w:trPr>
         <w:tc>
           <w:tcPr>
@@ -1604,21 +1533,6 @@
               </w:rPr>
               <w:t>Parts</w:t>
             </w:r>
-          </w:p>
-        </w:tc>
-        <w:tc>
-          <w:tcPr>
-            <w:tcW w:w="2830" w:type="dxa"/>
-          </w:tcPr>
-          <w:p>
-            <w:pPr>
-              <w:spacing w:before="200"/>
-              <w:rPr>
-                <w:rFonts w:ascii="Arial" w:hAnsi="Arial" w:cs="Arial"/>
-                <w:b/>
-                <w:bCs/>
-              </w:rPr>
-            </w:pPr>
           </w:p>
         </w:tc>
         <w:tc>
@@ -1655,6 +1569,7 @@
       <w:tr>
         <w:trPr>
           <w:trHeight w:val="576"/>
+          <w:jc w:val="center"/>
         </w:trPr>
         <w:tc>
           <w:tcPr>
@@ -1691,41 +1606,7 @@
               <w:rPr>
                 <w:rFonts w:ascii="Arial" w:hAnsi="Arial" w:cs="Arial"/>
               </w:rPr>
-              <w:t>{{parts</w:t>
-            </w:r>
-            <w:r>
-              <w:rPr>
-                <w:rFonts w:ascii="Arial" w:hAnsi="Arial" w:cs="Arial"/>
-              </w:rPr>
-              <w:t>_shop1</w:t>
-            </w:r>
-            <w:r>
-              <w:rPr>
-                <w:rFonts w:ascii="Arial" w:hAnsi="Arial" w:cs="Arial"/>
-              </w:rPr>
-              <w:t>_price1}}</w:t>
-            </w:r>
-          </w:p>
-        </w:tc>
-        <w:tc>
-          <w:tcPr>
-            <w:tcW w:w="2830" w:type="dxa"/>
-          </w:tcPr>
-          <w:p>
-            <w:pPr>
-              <w:spacing w:before="200"/>
-              <w:jc w:val="right"/>
-              <w:rPr>
-                <w:rFonts w:ascii="Arial" w:hAnsi="Arial" w:cs="Arial"/>
-                <w:b/>
-                <w:bCs/>
-              </w:rPr>
-            </w:pPr>
-            <w:r>
-              <w:rPr>
-                <w:rFonts w:ascii="Arial" w:hAnsi="Arial" w:cs="Arial"/>
-              </w:rPr>
-              <w:t>{{parts_shop2_price2}}</w:t>
+              <w:t>{{parts_shop1_price1}}</w:t>
             </w:r>
           </w:p>
         </w:tc>
@@ -1748,6 +1629,7 @@
       <w:tr>
         <w:trPr>
           <w:trHeight w:val="576"/>
+          <w:jc w:val="center"/>
         </w:trPr>
         <w:tc>
           <w:tcPr>
@@ -1790,36 +1672,7 @@
               <w:rPr>
                 <w:rFonts w:ascii="Arial" w:hAnsi="Arial" w:cs="Arial"/>
               </w:rPr>
-              <w:t>{{total_shop1</w:t>
-            </w:r>
-            <w:r>
-              <w:rPr>
-                <w:rFonts w:ascii="Arial" w:hAnsi="Arial" w:cs="Arial"/>
-              </w:rPr>
-              <w:t>}}</w:t>
-            </w:r>
-          </w:p>
-        </w:tc>
-        <w:tc>
-          <w:tcPr>
-            <w:tcW w:w="2830" w:type="dxa"/>
-            <w:shd w:val="clear" w:color="auto" w:fill="FFE599" w:themeFill="accent4" w:themeFillTint="66"/>
-          </w:tcPr>
-          <w:p>
-            <w:pPr>
-              <w:spacing w:before="200"/>
-              <w:jc w:val="right"/>
-              <w:rPr>
-                <w:rFonts w:ascii="Arial" w:hAnsi="Arial" w:cs="Arial"/>
-                <w:b/>
-                <w:bCs/>
-              </w:rPr>
-            </w:pPr>
-            <w:r>
-              <w:rPr>
-                <w:rFonts w:ascii="Arial" w:hAnsi="Arial" w:cs="Arial"/>
-              </w:rPr>
-              <w:t>{{total_shop2}}</w:t>
+              <w:t>{{total_shop1}}</w:t>
             </w:r>
           </w:p>
         </w:tc>
@@ -1843,6 +1696,7 @@
       <w:tr>
         <w:trPr>
           <w:trHeight w:val="576"/>
+          <w:jc w:val="center"/>
         </w:trPr>
         <w:tc>
           <w:tcPr>
@@ -1884,26 +1738,6 @@
                 <w:rFonts w:ascii="Arial" w:hAnsi="Arial" w:cs="Arial"/>
               </w:rPr>
               <w:t>{{vat1}}</w:t>
-            </w:r>
-          </w:p>
-        </w:tc>
-        <w:tc>
-          <w:tcPr>
-            <w:tcW w:w="2830" w:type="dxa"/>
-          </w:tcPr>
-          <w:p>
-            <w:pPr>
-              <w:spacing w:before="200"/>
-              <w:jc w:val="right"/>
-              <w:rPr>
-                <w:rFonts w:ascii="Arial" w:hAnsi="Arial" w:cs="Arial"/>
-              </w:rPr>
-            </w:pPr>
-            <w:r>
-              <w:rPr>
-                <w:rFonts w:ascii="Arial" w:hAnsi="Arial" w:cs="Arial"/>
-              </w:rPr>
-              <w:t>{{vat2}}</w:t>
             </w:r>
           </w:p>
         </w:tc>
@@ -1926,23 +1760,8 @@
       <w:tr>
         <w:trPr>
           <w:trHeight w:val="576"/>
+          <w:jc w:val="center"/>
         </w:trPr>
-        <w:tc>
-          <w:tcPr>
-            <w:tcW w:w="2830" w:type="dxa"/>
-            <w:shd w:val="clear" w:color="auto" w:fill="2F5496" w:themeFill="accent1" w:themeFillShade="BF"/>
-          </w:tcPr>
-          <w:p>
-            <w:pPr>
-              <w:spacing w:before="200"/>
-              <w:rPr>
-                <w:rFonts w:ascii="Arial" w:hAnsi="Arial" w:cs="Arial"/>
-                <w:b/>
-                <w:bCs/>
-              </w:rPr>
-            </w:pPr>
-          </w:p>
-        </w:tc>
         <w:tc>
           <w:tcPr>
             <w:tcW w:w="2830" w:type="dxa"/>
@@ -1995,6 +1814,7 @@
       <w:tr>
         <w:trPr>
           <w:trHeight w:val="576"/>
+          <w:jc w:val="center"/>
         </w:trPr>
         <w:tc>
           <w:tcPr>
@@ -2038,27 +1858,6 @@
                 <w:rFonts w:ascii="Arial" w:hAnsi="Arial" w:cs="Arial"/>
               </w:rPr>
               <w:t>{{total_amount1}}</w:t>
-            </w:r>
-          </w:p>
-        </w:tc>
-        <w:tc>
-          <w:tcPr>
-            <w:tcW w:w="2830" w:type="dxa"/>
-            <w:shd w:val="clear" w:color="auto" w:fill="FFE599" w:themeFill="accent4" w:themeFillTint="66"/>
-          </w:tcPr>
-          <w:p>
-            <w:pPr>
-              <w:spacing w:before="200"/>
-              <w:jc w:val="right"/>
-              <w:rPr>
-                <w:rFonts w:ascii="Arial" w:hAnsi="Arial" w:cs="Arial"/>
-              </w:rPr>
-            </w:pPr>
-            <w:r>
-              <w:rPr>
-                <w:rFonts w:ascii="Arial" w:hAnsi="Arial" w:cs="Arial"/>
-              </w:rPr>
-              <w:t>{{total_amount2}}</w:t>
             </w:r>
           </w:p>
         </w:tc>
@@ -2126,7 +1925,7 @@
       <w:tblPr>
         <w:tblStyle w:val="TableGrid"/>
         <w:tblpPr w:leftFromText="180" w:rightFromText="180" w:vertAnchor="text" w:horzAnchor="margin" w:tblpXSpec="center" w:tblpY="56"/>
-        <w:tblW w:w="0" w:type="auto"/>
+        <w:tblW w:w="11363" w:type="dxa"/>
         <w:tblBorders>
           <w:top w:val="none" w:sz="0" w:space="0" w:color="auto"/>
           <w:left w:val="none" w:sz="0" w:space="0" w:color="auto"/>
@@ -2138,15 +1937,15 @@
         <w:tblLook w:val="04A0" w:firstRow="1" w:lastRow="0" w:firstColumn="1" w:lastColumn="0" w:noHBand="0" w:noVBand="1"/>
       </w:tblPr>
       <w:tblGrid>
-        <w:gridCol w:w="2924"/>
-        <w:gridCol w:w="2929"/>
-        <w:gridCol w:w="2719"/>
+        <w:gridCol w:w="2921"/>
+        <w:gridCol w:w="2926"/>
+        <w:gridCol w:w="2758"/>
         <w:gridCol w:w="2758"/>
       </w:tblGrid>
       <w:tr>
         <w:tc>
           <w:tcPr>
-            <w:tcW w:w="2924" w:type="dxa"/>
+            <w:tcW w:w="2921" w:type="dxa"/>
           </w:tcPr>
           <w:p>
             <w:pPr>
@@ -2264,21 +2063,39 @@
                 <w:sz w:val="16"/>
                 <w:szCs w:val="16"/>
               </w:rPr>
-              <w:t>{{PREPARED_BY_POSITION}}</w:t>
-            </w:r>
-            <w:r>
-              <w:rPr>
-                <w:rFonts w:ascii="Arial" w:hAnsi="Arial" w:cs="Arial"/>
-                <w:sz w:val="18"/>
-                <w:szCs w:val="18"/>
-              </w:rPr>
-              <w:t xml:space="preserve">                                                                                                                                                </w:t>
-            </w:r>
-          </w:p>
-        </w:tc>
-        <w:tc>
-          <w:tcPr>
-            <w:tcW w:w="2929" w:type="dxa"/>
+              <w:t>{{PREPARED_BY_POSITION</w:t>
+            </w:r>
+            <w:proofErr w:type="gramStart"/>
+            <w:r>
+              <w:rPr>
+                <w:rFonts w:ascii="Arial" w:hAnsi="Arial" w:cs="Arial"/>
+                <w:sz w:val="16"/>
+                <w:szCs w:val="16"/>
+              </w:rPr>
+              <w:t>}}</w:t>
+            </w:r>
+            <w:r>
+              <w:rPr>
+                <w:rFonts w:ascii="Arial" w:hAnsi="Arial" w:cs="Arial"/>
+                <w:sz w:val="18"/>
+                <w:szCs w:val="18"/>
+              </w:rPr>
+              <w:t xml:space="preserve">   </w:t>
+            </w:r>
+            <w:proofErr w:type="gramEnd"/>
+            <w:r>
+              <w:rPr>
+                <w:rFonts w:ascii="Arial" w:hAnsi="Arial" w:cs="Arial"/>
+                <w:sz w:val="18"/>
+                <w:szCs w:val="18"/>
+              </w:rPr>
+              <w:t xml:space="preserve">                                                                                                                                             </w:t>
+            </w:r>
+          </w:p>
+        </w:tc>
+        <w:tc>
+          <w:tcPr>
+            <w:tcW w:w="2926" w:type="dxa"/>
           </w:tcPr>
           <w:p>
             <w:pPr>
@@ -2379,29 +2196,47 @@
         </w:tc>
         <w:tc>
           <w:tcPr>
-            <w:tcW w:w="2719" w:type="dxa"/>
-          </w:tcPr>
-          <w:p>
-            <w:pPr>
-              <w:spacing w:before="40" w:line="360" w:lineRule="auto"/>
-              <w:rPr>
-                <w:rFonts w:ascii="Arial" w:hAnsi="Arial" w:cs="Arial"/>
-                <w:b/>
-                <w:bCs/>
-                <w:sz w:val="18"/>
-                <w:szCs w:val="18"/>
-              </w:rPr>
-            </w:pPr>
-            <w:r>
-              <w:rPr>
-                <w:rFonts w:ascii="Arial" w:hAnsi="Arial" w:cs="Arial"/>
-                <w:b/>
-                <w:bCs/>
-                <w:sz w:val="18"/>
-                <w:szCs w:val="18"/>
-              </w:rPr>
-              <w:t>Verified by:</w:t>
-            </w:r>
+            <w:tcW w:w="2758" w:type="dxa"/>
+          </w:tcPr>
+          <w:p>
+            <w:pPr>
+              <w:rPr>
+                <w:rFonts w:ascii="Arial" w:hAnsi="Arial" w:cs="Arial"/>
+                <w:b/>
+                <w:bCs/>
+                <w:sz w:val="18"/>
+                <w:szCs w:val="18"/>
+              </w:rPr>
+            </w:pPr>
+            <w:r>
+              <w:rPr>
+                <w:rFonts w:ascii="Arial" w:hAnsi="Arial" w:cs="Arial"/>
+                <w:b/>
+                <w:bCs/>
+                <w:sz w:val="18"/>
+                <w:szCs w:val="18"/>
+              </w:rPr>
+              <w:t>Verified</w:t>
+            </w:r>
+            <w:r>
+              <w:rPr>
+                <w:rFonts w:ascii="Arial" w:hAnsi="Arial" w:cs="Arial"/>
+                <w:b/>
+                <w:bCs/>
+                <w:sz w:val="18"/>
+                <w:szCs w:val="18"/>
+              </w:rPr>
+              <w:t xml:space="preserve"> by:</w:t>
+            </w:r>
+          </w:p>
+          <w:p>
+            <w:pPr>
+              <w:rPr>
+                <w:rFonts w:ascii="Arial" w:hAnsi="Arial" w:cs="Arial"/>
+                <w:sz w:val="18"/>
+                <w:szCs w:val="18"/>
+              </w:rPr>
+            </w:pPr>
             <w:r>
               <w:rPr>
                 <w:rFonts w:ascii="Arial" w:hAnsi="Arial" w:cs="Arial"/>
@@ -2412,15 +2247,16 @@
               </w:rPr>
               <w:br/>
             </w:r>
-          </w:p>
-          <w:p>
-            <w:pPr>
-              <w:rPr>
-                <w:rFonts w:ascii="Arial" w:hAnsi="Arial" w:cs="Arial"/>
-                <w:sz w:val="18"/>
-                <w:szCs w:val="18"/>
-              </w:rPr>
-            </w:pPr>
+            <w:r>
+              <w:rPr>
+                <w:rFonts w:ascii="Arial" w:hAnsi="Arial" w:cs="Arial"/>
+                <w:b/>
+                <w:bCs/>
+                <w:sz w:val="18"/>
+                <w:szCs w:val="18"/>
+              </w:rPr>
+              <w:br/>
+            </w:r>
             <w:r>
               <w:rPr>
                 <w:rFonts w:ascii="Arial" w:hAnsi="Arial" w:cs="Arial"/>
@@ -2443,7 +2279,23 @@
                 <w:sz w:val="18"/>
                 <w:szCs w:val="18"/>
               </w:rPr>
-              <w:t>{{VERIFIED_BY}}</w:t>
+              <w:t>{{</w:t>
+            </w:r>
+            <w:r>
+              <w:rPr>
+                <w:rFonts w:ascii="Arial" w:hAnsi="Arial" w:cs="Arial"/>
+                <w:sz w:val="18"/>
+                <w:szCs w:val="18"/>
+              </w:rPr>
+              <w:t>VERIFIED</w:t>
+            </w:r>
+            <w:r>
+              <w:rPr>
+                <w:rFonts w:ascii="Arial" w:hAnsi="Arial" w:cs="Arial"/>
+                <w:sz w:val="18"/>
+                <w:szCs w:val="18"/>
+              </w:rPr>
+              <w:t>_BY}}</w:t>
             </w:r>
             <w:r>
               <w:rPr>
@@ -2456,10 +2308,42 @@
             <w:r>
               <w:rPr>
                 <w:rFonts w:ascii="Arial" w:hAnsi="Arial" w:cs="Arial"/>
-                <w:sz w:val="16"/>
-                <w:szCs w:val="16"/>
-              </w:rPr>
-              <w:t>{{VERIFIED_BY_POSITION}}</w:t>
+                <w:sz w:val="18"/>
+                <w:szCs w:val="18"/>
+              </w:rPr>
+              <w:t>{{</w:t>
+            </w:r>
+            <w:r>
+              <w:rPr>
+                <w:rFonts w:ascii="Arial" w:hAnsi="Arial" w:cs="Arial"/>
+                <w:sz w:val="18"/>
+                <w:szCs w:val="18"/>
+              </w:rPr>
+              <w:t>VERIFIED</w:t>
+            </w:r>
+            <w:r>
+              <w:rPr>
+                <w:rFonts w:ascii="Arial" w:hAnsi="Arial" w:cs="Arial"/>
+                <w:sz w:val="18"/>
+                <w:szCs w:val="18"/>
+              </w:rPr>
+              <w:t>_BY</w:t>
+            </w:r>
+            <w:r>
+              <w:rPr>
+                <w:rFonts w:ascii="Arial" w:hAnsi="Arial" w:cs="Arial"/>
+                <w:sz w:val="18"/>
+                <w:szCs w:val="18"/>
+              </w:rPr>
+              <w:t>_POSITION</w:t>
+            </w:r>
+            <w:r>
+              <w:rPr>
+                <w:rFonts w:ascii="Arial" w:hAnsi="Arial" w:cs="Arial"/>
+                <w:sz w:val="18"/>
+                <w:szCs w:val="18"/>
+              </w:rPr>
+              <w:t>}}</w:t>
             </w:r>
           </w:p>
         </w:tc>

</xml_diff>